<commit_message>
Add affected-valves and reverse-isolation re-feed steps to shutdown SOP
Extend SOP_document.docx with two procedural steps validated against live
pipe_084 topology (Bukit Batok Street 22):

- Item 11 (Identify affected valves): walk downstream from the shut pipe's
  to_id valve via open pipes; a valve is affected unless it has an open
  incoming feed from a valve not itself in the affected set (independent
  supply). For pipe_084: affected = valve_035, valve_036; valve_037 spared
  by alternate feed pipe_091.
- Item 13 (Reverse-isolation re-feed): from the tail-end valve back to and
  including the shut pipe, per adjacent pair open the reverse pipe then close
  its forward counterpart, strictly sequential and tail-first, so each valve
  is supplied before feeding the next. Final pair closes the shut pipe itself.

Co-Authored-By: Claude Opus 4.8 <noreply@anthropic.com>
</commit_message>
<xml_diff>
--- a/data/seed/sop_documents/SOP_document.docx
+++ b/data/seed/sop_documents/SOP_document.docx
@@ -504,16 +504,7 @@
         </w:numPr>
       </w:pPr>
       <w:r>
-        <w:t xml:space="preserve">If there was no alternate feed in step 9, stop </w:t>
-      </w:r>
-      <w:r>
-        <w:t>at this step</w:t>
-      </w:r>
-      <w:r>
-        <w:t xml:space="preserve">. If there is alternate feed, </w:t>
-      </w:r>
-      <w:r>
-        <w:t>proceed to step 12.</w:t>
+        <w:t>Identify the affected valves. Using the shutdown chain recorded above, start at the downstream valve of the pipe being shut (the valve whose id equals the to_id of that pipe) and mark it as an affected valve. Move downstream one valve at a time by following each pipe whose from_id equals the current valve id and whose status is open, until you reach the tail end valve. For every downstream valve you reach, examine all pipes whose to_id equals that valve id and whose status is open - these are the pipes currently feeding water into the valve. If the only open feed(s) into the valve come from the pipe being shut or from a valve that is itself already marked as affected, the valve has no independent water supply: mark it as an affected valve and continue downstream. If the valve has at least one open feed whose from_id is a valve that is not part of the affected set (a valve still supplied by a path that does not pass through the pipe being shut), then that valve has an alternate water supply, it is not affected, and the affected set ends at the valve before it. Record the final list of affected valves; these are the valves whose consumers lose water supply when the pipe is shut.</w:t>
       </w:r>
     </w:p>
     <w:p>
@@ -530,51 +521,41 @@
         </w:numPr>
       </w:pPr>
       <w:r>
-        <w:t xml:space="preserve">With the sequential shutdown chain shown in valve sequences, </w:t>
-      </w:r>
-      <w:r>
-        <w:t>we will now trace backwards. S</w:t>
-      </w:r>
-      <w:r>
-        <w:t xml:space="preserve">tart </w:t>
-      </w:r>
-      <w:r>
-        <w:t xml:space="preserve">with the tail end valve, check if there is a </w:t>
-      </w:r>
-      <w:proofErr w:type="spellStart"/>
-      <w:r>
-        <w:t>pipe_id</w:t>
-      </w:r>
-      <w:proofErr w:type="spellEnd"/>
-      <w:r>
-        <w:t xml:space="preserve"> that has </w:t>
-      </w:r>
-      <w:proofErr w:type="spellStart"/>
-      <w:r>
-        <w:t>from_id</w:t>
-      </w:r>
-      <w:proofErr w:type="spellEnd"/>
-      <w:r>
-        <w:t xml:space="preserve"> equals to the tail end valve id and the </w:t>
-      </w:r>
-      <w:proofErr w:type="spellStart"/>
-      <w:r>
-        <w:t>to_id</w:t>
-      </w:r>
-      <w:proofErr w:type="spellEnd"/>
-      <w:r>
-        <w:t xml:space="preserve"> of that </w:t>
-      </w:r>
-      <w:proofErr w:type="spellStart"/>
-      <w:r>
-        <w:t>pipe_id</w:t>
-      </w:r>
-      <w:proofErr w:type="spellEnd"/>
-      <w:r>
-        <w:t xml:space="preserve"> is equals to the next valve sequence in the sequential shutdown chain but in reverse, starting with the tail end valve. Check if the status of the pipe is set to “closed”. If it is set to “closed”, proceed to the next step. If not, </w:t>
-      </w:r>
-      <w:r>
-        <w:t>stop at this step and inform the user.</w:t>
+        <w:t xml:space="preserve">If there was no alternate feed in step 9, stop </w:t>
+      </w:r>
+      <w:r>
+        <w:t>at this step</w:t>
+      </w:r>
+      <w:r>
+        <w:t xml:space="preserve">. If there is alternate feed, </w:t>
+      </w:r>
+      <w:r>
+        <w:t>proceed to step 12.</w:t>
+      </w:r>
+    </w:p>
+    <w:p>
+      <w:pPr>
+        <w:pStyle w:val="ListParagraph"/>
+      </w:pPr>
+    </w:p>
+    <w:p>
+      <w:pPr>
+        <w:pStyle w:val="ListParagraph"/>
+        <w:numPr>
+          <w:ilvl w:val="0"/>
+          <w:numId w:val="1"/>
+        </w:numPr>
+      </w:pPr>
+      <w:proofErr w:type="spellStart"/>
+      <w:proofErr w:type="spellEnd"/>
+      <w:proofErr w:type="spellStart"/>
+      <w:proofErr w:type="spellEnd"/>
+      <w:proofErr w:type="spellStart"/>
+      <w:proofErr w:type="spellEnd"/>
+      <w:proofErr w:type="spellStart"/>
+      <w:proofErr w:type="spellEnd"/>
+      <w:r>
+        <w:t>With the sequential shutdown chain recorded above, re-feed the affected valves by reversing the flow, working backwards one valve pair at a time, sequentially, starting at the tail end valve and moving towards the upstream valve of the pipe being shut (the valve whose id equals the from_id of the pipe being shut). For the current pair, take the valve closer to the tail end and the next valve along the chain. Find the reverse pipe whose from_id equals the valve closer to the tail end and whose to_id equals the next valve, and confirm its status is 'closed'; if it is not 'closed', stop at this step and inform the user. Set this reverse pipe's status to 'open'. Then find its forward counterpart, the pipe with the from_id and to_id swapped (from_id equals the next valve and to_id equals the valve closer to the tail end), which is currently 'open', and set its status to 'closed'. Always open the reverse pipe before closing its forward counterpart, and always complete one pair fully before starting the next pair, so that each valve already has water before it is used to feed the next valve. Repeat for the next pair moving upstream along the chain. The final pair is the pipe being shut itself: open its reverse pipe (from_id equals the pipe being shut downstream valve, to_id equals its upstream valve) and then set the pipe being shut to closed, which is the actual shutdown action. After all pairs are completed, every affected valve is supplied from the tail end alternate feed, the pipe being shut is closed, and each physical pipe in the chain has exactly one direction set to open.</w:t>
       </w:r>
     </w:p>
     <w:sectPr>

</xml_diff>